<commit_message>
feat: newrequest and edit request enhancements
</commit_message>
<xml_diff>
--- a/apps/creditguard-service/src/templates/Letter of Comfort (Standard).docx
+++ b/apps/creditguard-service/src/templates/Letter of Comfort (Standard).docx
@@ -72,29 +72,38 @@
       <w:pPr>
         <w:jc w:val="both"/>
         <w:rPr>
+          <w:kern w:val="2"/>
+          <w14:ligatures w14:val="standardContextual"/>
+        </w:rPr>
+      </w:pPr>
+      <w:r>
+        <w:rPr>
+          <w:rFonts w:ascii="Arial" w:hAnsi="Arial" w:cs="Arial"/>
+          <w:sz w:val="22"/>
+          <w:szCs w:val="22"/>
+        </w:rPr>
+        <w:t>To:    </w:t>
+      </w:r>
+      <w:proofErr w:type="gramStart"/>
+      <w:r>
+        <w:rPr>
+          <w:rFonts w:ascii="Arial" w:hAnsi="Arial" w:cs="Arial"/>
+          <w:sz w:val="22"/>
+          <w:szCs w:val="22"/>
+        </w:rPr>
+        <w:t xml:space="preserve">   </w:t>
+      </w:r>
+      <w:r>
+        <w:rPr>
           <w:rFonts w:ascii="Arial" w:hAnsi="Arial" w:cs="Arial"/>
           <w:b/>
           <w:bCs/>
           <w:sz w:val="22"/>
           <w:szCs w:val="22"/>
         </w:rPr>
-      </w:pPr>
-      <w:r>
-        <w:rPr>
-          <w:rFonts w:ascii="Arial" w:hAnsi="Arial" w:cs="Arial"/>
-          <w:sz w:val="22"/>
-          <w:szCs w:val="22"/>
-        </w:rPr>
-        <w:t xml:space="preserve">To: </w:t>
-      </w:r>
-      <w:r>
-        <w:rPr>
-          <w:rFonts w:ascii="Arial" w:hAnsi="Arial" w:cs="Arial"/>
-          <w:sz w:val="22"/>
-          <w:szCs w:val="22"/>
-        </w:rPr>
-        <w:tab/>
-      </w:r>
+        <w:t>{</w:t>
+      </w:r>
+      <w:proofErr w:type="gramEnd"/>
       <w:r>
         <w:rPr>
           <w:rFonts w:ascii="Arial" w:hAnsi="Arial" w:cs="Arial"/>
@@ -103,37 +112,34 @@
           <w:sz w:val="22"/>
           <w:szCs w:val="22"/>
         </w:rPr>
-        <w:t>[insert SELLER’s name]</w:t>
+        <w:t>{SELLER’s name}}</w:t>
       </w:r>
     </w:p>
     <w:p>
       <w:pPr>
         <w:jc w:val="both"/>
         <w:rPr>
+          <w:kern w:val="2"/>
+          <w14:ligatures w14:val="standardContextual"/>
+        </w:rPr>
+      </w:pPr>
+      <w:r>
+        <w:rPr>
+          <w:rFonts w:ascii="Arial" w:hAnsi="Arial" w:cs="Arial"/>
+          <w:sz w:val="22"/>
+          <w:szCs w:val="22"/>
+        </w:rPr>
+        <w:t xml:space="preserve">            </w:t>
+      </w:r>
+      <w:r>
+        <w:rPr>
           <w:rFonts w:ascii="Arial" w:hAnsi="Arial" w:cs="Arial"/>
           <w:b/>
           <w:bCs/>
           <w:sz w:val="22"/>
           <w:szCs w:val="22"/>
         </w:rPr>
-      </w:pPr>
-      <w:r>
-        <w:rPr>
-          <w:rFonts w:ascii="Arial" w:hAnsi="Arial" w:cs="Arial"/>
-          <w:sz w:val="22"/>
-          <w:szCs w:val="22"/>
-        </w:rPr>
-        <w:tab/>
-      </w:r>
-      <w:r>
-        <w:rPr>
-          <w:rFonts w:ascii="Arial" w:hAnsi="Arial" w:cs="Arial"/>
-          <w:b/>
-          <w:bCs/>
-          <w:sz w:val="22"/>
-          <w:szCs w:val="22"/>
-        </w:rPr>
-        <w:t>[insert SELLER’s address]</w:t>
+        <w:t>{{SELLER’s address}}</w:t>
       </w:r>
     </w:p>
     <w:p>
@@ -151,8 +157,6 @@
         <w:jc w:val="both"/>
         <w:rPr>
           <w:rFonts w:ascii="Arial" w:hAnsi="Arial" w:cs="Arial"/>
-          <w:sz w:val="22"/>
-          <w:szCs w:val="22"/>
         </w:rPr>
       </w:pPr>
       <w:r>
@@ -168,17 +172,103 @@
           <w:rFonts w:ascii="Arial" w:hAnsi="Arial" w:cs="Arial"/>
           <w:sz w:val="22"/>
           <w:szCs w:val="22"/>
+          <w:shd w:val="clear" w:color="auto" w:fill="D3D3D3"/>
+        </w:rPr>
+        <w:t>{{Purchase Order No}}</w:t>
+      </w:r>
+      <w:r>
+        <w:rPr>
+          <w:rFonts w:ascii="Arial" w:hAnsi="Arial" w:cs="Arial"/>
+          <w:sz w:val="22"/>
+          <w:szCs w:val="22"/>
+        </w:rPr>
+        <w:t>,</w:t>
+      </w:r>
+      <w:r>
+        <w:rPr>
+          <w:rFonts w:ascii="Arial" w:hAnsi="Arial" w:cs="Arial"/>
+          <w:sz w:val="22"/>
+          <w:szCs w:val="22"/>
+        </w:rPr>
+        <w:t xml:space="preserve"> dated </w:t>
+      </w:r>
+      <w:r>
+        <w:rPr>
+          <w:rFonts w:ascii="Arial" w:hAnsi="Arial" w:cs="Arial"/>
+          <w:sz w:val="22"/>
+          <w:szCs w:val="22"/>
+          <w:shd w:val="clear" w:color="auto" w:fill="D3D3D3"/>
+        </w:rPr>
+        <w:t>{{Purchase Order date}}</w:t>
+      </w:r>
+      <w:r>
+        <w:rPr>
+          <w:rFonts w:ascii="Arial" w:hAnsi="Arial" w:cs="Arial"/>
+          <w:sz w:val="22"/>
+          <w:szCs w:val="22"/>
+        </w:rPr>
+        <w:t xml:space="preserve"> (“</w:t>
+      </w:r>
+      <w:r>
+        <w:rPr>
+          <w:rFonts w:ascii="Arial" w:hAnsi="Arial" w:cs="Arial"/>
+          <w:b/>
+          <w:sz w:val="22"/>
+          <w:szCs w:val="22"/>
+        </w:rPr>
+        <w:t>ORDER</w:t>
+      </w:r>
+      <w:r>
+        <w:rPr>
+          <w:rFonts w:ascii="Arial" w:hAnsi="Arial" w:cs="Arial"/>
+          <w:sz w:val="22"/>
+          <w:szCs w:val="22"/>
+        </w:rPr>
+        <w:t xml:space="preserve">”) made between </w:t>
+      </w:r>
+      <w:r>
+        <w:rPr>
+          <w:rFonts w:ascii="Arial" w:hAnsi="Arial" w:cs="Arial"/>
+          <w:sz w:val="22"/>
+          <w:szCs w:val="22"/>
+          <w:shd w:val="clear" w:color="auto" w:fill="D3D3D3"/>
+        </w:rPr>
+        <w:t>{{</w:t>
+      </w:r>
+      <w:r>
+        <w:rPr>
+          <w:rFonts w:ascii="Arial" w:hAnsi="Arial" w:cs="Arial"/>
+          <w:sz w:val="22"/>
+          <w:szCs w:val="22"/>
           <w:highlight w:val="lightGray"/>
         </w:rPr>
-        <w:t>[insert</w:t>
-      </w:r>
-      <w:r>
-        <w:rPr>
-          <w:rFonts w:ascii="Arial" w:hAnsi="Arial" w:cs="Arial"/>
-          <w:sz w:val="22"/>
-          <w:szCs w:val="22"/>
-        </w:rPr>
-        <w:t xml:space="preserve">], dated </w:t>
+        <w:t>Procurement Agent entity/branch</w:t>
+      </w:r>
+      <w:r>
+        <w:rPr>
+          <w:rFonts w:ascii="Arial" w:hAnsi="Arial" w:cs="Arial"/>
+          <w:sz w:val="22"/>
+          <w:szCs w:val="22"/>
+          <w:shd w:val="clear" w:color="auto" w:fill="D3D3D3"/>
+        </w:rPr>
+        <w:t>}}</w:t>
+      </w:r>
+      <w:r>
+        <w:rPr>
+          <w:rFonts w:ascii="Arial" w:hAnsi="Arial" w:cs="Arial"/>
+          <w:sz w:val="22"/>
+          <w:szCs w:val="22"/>
+        </w:rPr>
+        <w:t xml:space="preserve"> whose registered address is </w:t>
+      </w:r>
+      <w:r>
+        <w:rPr>
+          <w:rFonts w:ascii="Arial" w:hAnsi="Arial" w:cs="Arial"/>
+          <w:sz w:val="22"/>
+          <w:szCs w:val="22"/>
+          <w:shd w:val="clear" w:color="auto" w:fill="D3D3D3"/>
+        </w:rPr>
+        <w:t>{{</w:t>
       </w:r>
       <w:r>
         <w:rPr>
@@ -187,7 +277,16 @@
           <w:szCs w:val="22"/>
           <w:highlight w:val="lightGray"/>
         </w:rPr>
-        <w:t>[insert]</w:t>
+        <w:t>Procurement Agent entity/branch address</w:t>
+      </w:r>
+      <w:r>
+        <w:rPr>
+          <w:rFonts w:ascii="Arial" w:hAnsi="Arial" w:cs="Arial"/>
+          <w:sz w:val="22"/>
+          <w:szCs w:val="22"/>
+          <w:shd w:val="clear" w:color="auto" w:fill="D3D3D3"/>
+        </w:rPr>
+        <w:t>}}</w:t>
       </w:r>
       <w:r>
         <w:rPr>
@@ -204,15 +303,24 @@
           <w:sz w:val="22"/>
           <w:szCs w:val="22"/>
         </w:rPr>
-        <w:t>ORDER</w:t>
-      </w:r>
-      <w:r>
-        <w:rPr>
-          <w:rFonts w:ascii="Arial" w:hAnsi="Arial" w:cs="Arial"/>
-          <w:sz w:val="22"/>
-          <w:szCs w:val="22"/>
-        </w:rPr>
-        <w:t xml:space="preserve">”) made between </w:t>
+        <w:t>PURCHASER</w:t>
+      </w:r>
+      <w:r>
+        <w:rPr>
+          <w:rFonts w:ascii="Arial" w:hAnsi="Arial" w:cs="Arial"/>
+          <w:sz w:val="22"/>
+          <w:szCs w:val="22"/>
+        </w:rPr>
+        <w:t xml:space="preserve">”) and </w:t>
+      </w:r>
+      <w:r>
+        <w:rPr>
+          <w:rFonts w:ascii="Arial" w:hAnsi="Arial" w:cs="Arial"/>
+          <w:sz w:val="22"/>
+          <w:szCs w:val="22"/>
+          <w:shd w:val="clear" w:color="auto" w:fill="D3D3D3"/>
+        </w:rPr>
+        <w:t>{{</w:t>
       </w:r>
       <w:r>
         <w:rPr>
@@ -221,15 +329,33 @@
           <w:szCs w:val="22"/>
           <w:highlight w:val="lightGray"/>
         </w:rPr>
-        <w:t>[insert Procurement Agent entity/branch</w:t>
-      </w:r>
-      <w:r>
-        <w:rPr>
-          <w:rFonts w:ascii="Arial" w:hAnsi="Arial" w:cs="Arial"/>
-          <w:sz w:val="22"/>
-          <w:szCs w:val="22"/>
-        </w:rPr>
-        <w:t>] whose registered address is [</w:t>
+        <w:t>vendor’s name</w:t>
+      </w:r>
+      <w:r>
+        <w:rPr>
+          <w:rFonts w:ascii="Arial" w:hAnsi="Arial" w:cs="Arial"/>
+          <w:sz w:val="22"/>
+          <w:szCs w:val="22"/>
+          <w:shd w:val="clear" w:color="auto" w:fill="D3D3D3"/>
+        </w:rPr>
+        <w:t>}}</w:t>
+      </w:r>
+      <w:r>
+        <w:rPr>
+          <w:rFonts w:ascii="Arial" w:hAnsi="Arial" w:cs="Arial"/>
+          <w:sz w:val="22"/>
+          <w:szCs w:val="22"/>
+        </w:rPr>
+        <w:t xml:space="preserve"> whose registered address is </w:t>
+      </w:r>
+      <w:r>
+        <w:rPr>
+          <w:rFonts w:ascii="Arial" w:hAnsi="Arial" w:cs="Arial"/>
+          <w:sz w:val="22"/>
+          <w:szCs w:val="22"/>
+          <w:shd w:val="clear" w:color="auto" w:fill="D3D3D3"/>
+        </w:rPr>
+        <w:t>{{</w:t>
       </w:r>
       <w:r>
         <w:rPr>
@@ -238,66 +364,24 @@
           <w:szCs w:val="22"/>
           <w:highlight w:val="lightGray"/>
         </w:rPr>
-        <w:t>insert Procurement Agent entity/branch address</w:t>
-      </w:r>
-      <w:r>
-        <w:rPr>
-          <w:rFonts w:ascii="Arial" w:hAnsi="Arial" w:cs="Arial"/>
-          <w:sz w:val="22"/>
-          <w:szCs w:val="22"/>
-        </w:rPr>
-        <w:t>] (“</w:t>
-      </w:r>
-      <w:r>
-        <w:rPr>
-          <w:rFonts w:ascii="Arial" w:hAnsi="Arial" w:cs="Arial"/>
-          <w:b/>
-          <w:sz w:val="22"/>
-          <w:szCs w:val="22"/>
-        </w:rPr>
-        <w:t>PURCHASER</w:t>
-      </w:r>
-      <w:r>
-        <w:rPr>
-          <w:rFonts w:ascii="Arial" w:hAnsi="Arial" w:cs="Arial"/>
-          <w:sz w:val="22"/>
-          <w:szCs w:val="22"/>
-        </w:rPr>
-        <w:t>”) and [</w:t>
-      </w:r>
-      <w:r>
-        <w:rPr>
-          <w:rFonts w:ascii="Arial" w:hAnsi="Arial" w:cs="Arial"/>
-          <w:sz w:val="22"/>
-          <w:szCs w:val="22"/>
-          <w:highlight w:val="lightGray"/>
-        </w:rPr>
-        <w:t>insert vendor’s name</w:t>
-      </w:r>
-      <w:r>
-        <w:rPr>
-          <w:rFonts w:ascii="Arial" w:hAnsi="Arial" w:cs="Arial"/>
-          <w:sz w:val="22"/>
-          <w:szCs w:val="22"/>
-        </w:rPr>
-        <w:t>] whose registered address is [</w:t>
-      </w:r>
-      <w:r>
-        <w:rPr>
-          <w:rFonts w:ascii="Arial" w:hAnsi="Arial" w:cs="Arial"/>
-          <w:sz w:val="22"/>
-          <w:szCs w:val="22"/>
-          <w:highlight w:val="lightGray"/>
-        </w:rPr>
-        <w:t>insert vendor’s address</w:t>
-      </w:r>
-      <w:r>
-        <w:rPr>
-          <w:rFonts w:ascii="Arial" w:hAnsi="Arial" w:cs="Arial"/>
-          <w:sz w:val="22"/>
-          <w:szCs w:val="22"/>
-        </w:rPr>
-        <w:t>] (“</w:t>
+        <w:t>vendor’s address</w:t>
+      </w:r>
+      <w:r>
+        <w:rPr>
+          <w:rFonts w:ascii="Arial" w:hAnsi="Arial" w:cs="Arial"/>
+          <w:sz w:val="22"/>
+          <w:szCs w:val="22"/>
+          <w:shd w:val="clear" w:color="auto" w:fill="D3D3D3"/>
+        </w:rPr>
+        <w:t>}}</w:t>
+      </w:r>
+      <w:r>
+        <w:rPr>
+          <w:rFonts w:ascii="Arial" w:hAnsi="Arial" w:cs="Arial"/>
+          <w:sz w:val="22"/>
+          <w:szCs w:val="22"/>
+        </w:rPr>
+        <w:t xml:space="preserve"> (“</w:t>
       </w:r>
       <w:r>
         <w:rPr>
@@ -574,9 +658,11 @@
     </w:p>
     <w:p>
       <w:pPr>
-        <w:autoSpaceDE w:val="0"/>
-        <w:autoSpaceDN w:val="0"/>
-        <w:adjustRightInd w:val="0"/>
+        <w:rPr>
+          <w:rFonts w:ascii="Arial" w:hAnsi="Arial" w:cs="Arial"/>
+        </w:rPr>
+      </w:pPr>
+      <w:r>
         <w:rPr>
           <w:rFonts w:ascii="Arial" w:hAnsi="Arial" w:cs="Arial"/>
           <w:color w:val="000000"/>
@@ -584,7 +670,8 @@
           <w:szCs w:val="22"/>
           <w:lang w:val="en-GB"/>
         </w:rPr>
-      </w:pPr>
+        <w:t xml:space="preserve">This letter and its benefits are not assignable. This </w:t>
+      </w:r>
       <w:r>
         <w:rPr>
           <w:rFonts w:ascii="Arial" w:hAnsi="Arial" w:cs="Arial"/>
@@ -593,7 +680,7 @@
           <w:szCs w:val="22"/>
           <w:lang w:val="en-GB"/>
         </w:rPr>
-        <w:t xml:space="preserve">This letter and its benefits are not assignable. This </w:t>
+        <w:t>letter</w:t>
       </w:r>
       <w:r>
         <w:rPr>
@@ -603,7 +690,7 @@
           <w:szCs w:val="22"/>
           <w:lang w:val="en-GB"/>
         </w:rPr>
-        <w:t>letter</w:t>
+        <w:t xml:space="preserve"> shall be exclusively governed by and construed in accordance with the laws of </w:t>
       </w:r>
       <w:r>
         <w:rPr>
@@ -611,9 +698,10 @@
           <w:color w:val="000000"/>
           <w:sz w:val="22"/>
           <w:szCs w:val="22"/>
+          <w:shd w:val="clear" w:color="auto" w:fill="D3D3D3"/>
           <w:lang w:val="en-GB"/>
         </w:rPr>
-        <w:t xml:space="preserve"> shall be exclusively governed by and construed in accordance with the laws of </w:t>
+        <w:t>{{governing law jurisdiction}}</w:t>
       </w:r>
       <w:r>
         <w:rPr>
@@ -621,10 +709,9 @@
           <w:color w:val="000000"/>
           <w:sz w:val="22"/>
           <w:szCs w:val="22"/>
-          <w:highlight w:val="lightGray"/>
           <w:lang w:val="en-GB"/>
         </w:rPr>
-        <w:t>____________</w:t>
+        <w:t>.</w:t>
       </w:r>
       <w:r>
         <w:rPr>
@@ -634,7 +721,7 @@
           <w:szCs w:val="22"/>
           <w:lang w:val="en-GB"/>
         </w:rPr>
-        <w:t xml:space="preserve">. To the extent that a dispute arises under this letter, the dispute resolution procedure in the ORDER is expressly incorporated herein mutatis mutandis.  </w:t>
+        <w:t xml:space="preserve"> To the extent that a dispute arises under this letter, the dispute resolution procedure in the ORDER is expressly incorporated herein mutatis mutandis.  </w:t>
       </w:r>
     </w:p>
     <w:p>
@@ -667,28 +754,36 @@
     </w:p>
     <w:p>
       <w:pPr>
-        <w:pStyle w:val="BodyText0"/>
+        <w:pStyle w:val="BodyText"/>
+        <w:rPr>
+          <w:rFonts w:ascii="Arial" w:hAnsi="Arial" w:cs="Arial"/>
+        </w:rPr>
+      </w:pPr>
+      <w:r>
+        <w:rPr>
+          <w:rFonts w:ascii="Arial" w:hAnsi="Arial" w:cs="Arial"/>
+          <w:b/>
+          <w:bCs/>
+          <w:shd w:val="clear" w:color="auto" w:fill="D3D3D3"/>
+        </w:rPr>
+        <w:t>{{</w:t>
+      </w:r>
+      <w:r>
         <w:rPr>
           <w:rFonts w:ascii="Arial" w:hAnsi="Arial" w:cs="Arial"/>
           <w:b/>
           <w:highlight w:val="lightGray"/>
         </w:rPr>
-      </w:pPr>
+        <w:t xml:space="preserve">McDermott </w:t>
+      </w:r>
       <w:r>
         <w:rPr>
           <w:rFonts w:ascii="Arial" w:hAnsi="Arial" w:cs="Arial"/>
           <w:b/>
-          <w:highlight w:val="lightGray"/>
-        </w:rPr>
-        <w:t xml:space="preserve">McDermott </w:t>
-      </w:r>
-      <w:r>
-        <w:rPr>
-          <w:rFonts w:ascii="Arial" w:hAnsi="Arial" w:cs="Arial"/>
-          <w:b/>
-          <w:highlight w:val="lightGray"/>
-        </w:rPr>
-        <w:t>……………</w:t>
+          <w:bCs/>
+          <w:shd w:val="clear" w:color="auto" w:fill="D3D3D3"/>
+        </w:rPr>
+        <w:t>entity}}</w:t>
       </w:r>
     </w:p>
     <w:p>
@@ -702,82 +797,100 @@
     </w:p>
     <w:p>
       <w:pPr>
-        <w:pStyle w:val="BodyText0"/>
+        <w:pStyle w:val="BodyText"/>
+        <w:rPr>
+          <w:rFonts w:ascii="Arial" w:hAnsi="Arial" w:cs="Arial"/>
+        </w:rPr>
+      </w:pPr>
+      <w:r>
         <w:rPr>
           <w:rFonts w:ascii="Arial" w:hAnsi="Arial" w:cs="Arial"/>
           <w:color w:val="C0C0C0"/>
-          <w:highlight w:val="lightGray"/>
+          <w:shd w:val="clear" w:color="auto" w:fill="D3D3D3"/>
           <w:lang w:val="en-GB"/>
         </w:rPr>
+        <w:t xml:space="preserve">{{signature}}   </w:t>
+      </w:r>
+    </w:p>
+    <w:p>
+      <w:pPr>
+        <w:pStyle w:val="BodyText"/>
+        <w:rPr>
+          <w:rFonts w:ascii="Arial" w:hAnsi="Arial" w:cs="Arial"/>
+        </w:rPr>
       </w:pPr>
-      <w:r>
-        <w:rPr>
-          <w:rFonts w:ascii="Arial" w:hAnsi="Arial" w:cs="Arial"/>
-          <w:color w:val="C0C0C0"/>
-          <w:highlight w:val="lightGray"/>
-          <w:lang w:val="en-GB"/>
-        </w:rPr>
-        <w:t xml:space="preserve">____________________________   </w:t>
+      <w:proofErr w:type="gramStart"/>
+      <w:r>
+        <w:rPr>
+          <w:rFonts w:ascii="Arial" w:hAnsi="Arial" w:cs="Arial"/>
+          <w:shd w:val="clear" w:color="auto" w:fill="D3D3D3"/>
+        </w:rPr>
+        <w:t>Name: {{</w:t>
+      </w:r>
+      <w:proofErr w:type="gramEnd"/>
+      <w:r>
+        <w:rPr>
+          <w:rFonts w:ascii="Arial" w:hAnsi="Arial" w:cs="Arial"/>
+          <w:shd w:val="clear" w:color="auto" w:fill="D3D3D3"/>
+        </w:rPr>
+        <w:t>signatory name}}</w:t>
       </w:r>
     </w:p>
     <w:p>
       <w:pPr>
-        <w:pStyle w:val="BodyText0"/>
-        <w:rPr>
-          <w:rFonts w:ascii="Arial" w:hAnsi="Arial" w:cs="Arial"/>
-          <w:highlight w:val="lightGray"/>
+        <w:pStyle w:val="BodyText"/>
+        <w:rPr>
+          <w:rFonts w:ascii="Arial" w:hAnsi="Arial" w:cs="Arial"/>
         </w:rPr>
       </w:pPr>
-      <w:r>
-        <w:rPr>
-          <w:rFonts w:ascii="Arial" w:hAnsi="Arial" w:cs="Arial"/>
-          <w:highlight w:val="lightGray"/>
-        </w:rPr>
-        <w:t>Name: …………………..</w:t>
+      <w:proofErr w:type="gramStart"/>
+      <w:r>
+        <w:rPr>
+          <w:rFonts w:ascii="Arial" w:hAnsi="Arial" w:cs="Arial"/>
+          <w:shd w:val="clear" w:color="auto" w:fill="D3D3D3"/>
+        </w:rPr>
+        <w:t>Title: {{</w:t>
+      </w:r>
+      <w:proofErr w:type="gramEnd"/>
+      <w:r>
+        <w:rPr>
+          <w:rFonts w:ascii="Arial" w:hAnsi="Arial" w:cs="Arial"/>
+          <w:shd w:val="clear" w:color="auto" w:fill="D3D3D3"/>
+        </w:rPr>
+        <w:t>signatory title}}</w:t>
       </w:r>
     </w:p>
     <w:p>
       <w:pPr>
-        <w:pStyle w:val="BodyText0"/>
-        <w:rPr>
-          <w:rFonts w:ascii="Arial" w:hAnsi="Arial" w:cs="Arial"/>
-          <w:highlight w:val="lightGray"/>
+        <w:pStyle w:val="BodyText"/>
+        <w:rPr>
+          <w:rFonts w:ascii="Arial" w:hAnsi="Arial" w:cs="Arial"/>
         </w:rPr>
       </w:pPr>
-      <w:r>
-        <w:rPr>
-          <w:rFonts w:ascii="Arial" w:hAnsi="Arial" w:cs="Arial"/>
-          <w:highlight w:val="lightGray"/>
-        </w:rPr>
-        <w:t>Title: …………………..</w:t>
-      </w:r>
-    </w:p>
-    <w:p>
-      <w:pPr>
-        <w:pStyle w:val="BodyText0"/>
-        <w:rPr>
-          <w:rFonts w:ascii="Arial" w:hAnsi="Arial" w:cs="Arial"/>
-        </w:rPr>
-      </w:pPr>
-      <w:r>
-        <w:rPr>
-          <w:rFonts w:ascii="Arial" w:hAnsi="Arial" w:cs="Arial"/>
-          <w:highlight w:val="lightGray"/>
-        </w:rPr>
-        <w:t>Date: …………</w:t>
-      </w:r>
-      <w:r>
-        <w:rPr>
-          <w:rFonts w:ascii="Arial" w:hAnsi="Arial" w:cs="Arial"/>
-          <w:highlight w:val="lightGray"/>
-        </w:rPr>
-        <w:t>...........</w:t>
+      <w:proofErr w:type="gramStart"/>
+      <w:r>
+        <w:rPr>
+          <w:rFonts w:ascii="Arial" w:hAnsi="Arial" w:cs="Arial"/>
+          <w:shd w:val="clear" w:color="auto" w:fill="D3D3D3"/>
+        </w:rPr>
+        <w:t>Date: {{</w:t>
+      </w:r>
+      <w:proofErr w:type="gramEnd"/>
+      <w:r>
+        <w:rPr>
+          <w:rFonts w:ascii="Arial" w:hAnsi="Arial" w:cs="Arial"/>
+          <w:shd w:val="clear" w:color="auto" w:fill="D3D3D3"/>
+        </w:rPr>
+        <w:t>signature date}}</w:t>
       </w:r>
     </w:p>
     <w:sectPr>
-      <w:headerReference w:type="default" r:id="rId10"/>
-      <w:footerReference w:type="default" r:id="rId11"/>
-      <w:headerReference w:type="first" r:id="rId12"/>
+      <w:headerReference w:type="even" r:id="rId10"/>
+      <w:headerReference w:type="default" r:id="rId11"/>
+      <w:footerReference w:type="even" r:id="rId12"/>
+      <w:footerReference w:type="default" r:id="rId13"/>
+      <w:headerReference w:type="first" r:id="rId14"/>
+      <w:footerReference w:type="first" r:id="rId15"/>
       <w:pgSz w:w="12240" w:h="15840"/>
       <w:pgMar w:top="2070" w:right="1080" w:bottom="1080" w:left="1080" w:header="810" w:footer="576" w:gutter="0"/>
       <w:cols w:space="720"/>
@@ -807,6 +920,16 @@
 </file>
 
 <file path=word/footer1.xml><?xml version="1.0" encoding="utf-8"?>
+<w:ftr xmlns:wpc="http://schemas.microsoft.com/office/word/2010/wordprocessingCanvas" xmlns:cx="http://schemas.microsoft.com/office/drawing/2014/chartex" xmlns:cx1="http://schemas.microsoft.com/office/drawing/2015/9/8/chartex" xmlns:cx2="http://schemas.microsoft.com/office/drawing/2015/10/21/chartex" xmlns:cx3="http://schemas.microsoft.com/office/drawing/2016/5/9/chartex" xmlns:cx4="http://schemas.microsoft.com/office/drawing/2016/5/10/chartex" xmlns:cx5="http://schemas.microsoft.com/office/drawing/2016/5/11/chartex" xmlns:cx6="http://schemas.microsoft.com/office/drawing/2016/5/12/chartex" xmlns:cx7="http://schemas.microsoft.com/office/drawing/2016/5/13/chartex" xmlns:cx8="http://schemas.microsoft.com/office/drawing/2016/5/14/chartex" xmlns:mc="http://schemas.openxmlformats.org/markup-compatibility/2006" xmlns:aink="http://schemas.microsoft.com/office/drawing/2016/ink" xmlns:am3d="http://schemas.microsoft.com/office/drawing/2017/model3d" xmlns:o="urn:schemas-microsoft-com:office:office" xmlns:oel="http://schemas.microsoft.com/office/2019/extlst" xmlns:r="http://schemas.openxmlformats.org/officeDocument/2006/relationships" xmlns:m="http://schemas.openxmlformats.org/officeDocument/2006/math" xmlns:v="urn:schemas-microsoft-com:vml" xmlns:wp14="http://schemas.microsoft.com/office/word/2010/wordprocessingDrawing" xmlns:wp="http://schemas.openxmlformats.org/drawingml/2006/wordprocessingDrawing" xmlns:w10="urn:schemas-microsoft-com:office:word" xmlns:w="http://schemas.openxmlformats.org/wordprocessingml/2006/main" xmlns:w14="http://schemas.microsoft.com/office/word/2010/wordml" xmlns:w15="http://schemas.microsoft.com/office/word/2012/wordml" xmlns:w16cex="http://schemas.microsoft.com/office/word/2018/wordml/cex" xmlns:w16cid="http://schemas.microsoft.com/office/word/2016/wordml/cid" xmlns:w16="http://schemas.microsoft.com/office/word/2018/wordml" xmlns:w16du="http://schemas.microsoft.com/office/word/2023/wordml/word16du" xmlns:w16sdtdh="http://schemas.microsoft.com/office/word/2020/wordml/sdtdatahash" xmlns:w16sdtfl="http://schemas.microsoft.com/office/word/2024/wordml/sdtformatlock" xmlns:w16se="http://schemas.microsoft.com/office/word/2015/wordml/symex" xmlns:wpg="http://schemas.microsoft.com/office/word/2010/wordprocessingGroup" xmlns:wpi="http://schemas.microsoft.com/office/word/2010/wordprocessingInk" xmlns:wne="http://schemas.microsoft.com/office/word/2006/wordml" xmlns:wps="http://schemas.microsoft.com/office/word/2010/wordprocessingShape" mc:Ignorable="w14 w15 w16se w16cid w16 w16cex w16sdtdh w16sdtfl w16du wp14">
+  <w:p>
+    <w:pPr>
+      <w:pStyle w:val="Footer"/>
+    </w:pPr>
+  </w:p>
+</w:ftr>
+</file>
+
+<file path=word/footer2.xml><?xml version="1.0" encoding="utf-8"?>
 <w:ftr xmlns:wpc="http://schemas.microsoft.com/office/word/2010/wordprocessingCanvas" xmlns:cx="http://schemas.microsoft.com/office/drawing/2014/chartex" xmlns:cx1="http://schemas.microsoft.com/office/drawing/2015/9/8/chartex" xmlns:cx2="http://schemas.microsoft.com/office/drawing/2015/10/21/chartex" xmlns:cx3="http://schemas.microsoft.com/office/drawing/2016/5/9/chartex" xmlns:cx4="http://schemas.microsoft.com/office/drawing/2016/5/10/chartex" xmlns:cx5="http://schemas.microsoft.com/office/drawing/2016/5/11/chartex" xmlns:cx6="http://schemas.microsoft.com/office/drawing/2016/5/12/chartex" xmlns:cx7="http://schemas.microsoft.com/office/drawing/2016/5/13/chartex" xmlns:cx8="http://schemas.microsoft.com/office/drawing/2016/5/14/chartex" xmlns:mc="http://schemas.openxmlformats.org/markup-compatibility/2006" xmlns:aink="http://schemas.microsoft.com/office/drawing/2016/ink" xmlns:am3d="http://schemas.microsoft.com/office/drawing/2017/model3d" xmlns:o="urn:schemas-microsoft-com:office:office" xmlns:oel="http://schemas.microsoft.com/office/2019/extlst" xmlns:r="http://schemas.openxmlformats.org/officeDocument/2006/relationships" xmlns:m="http://schemas.openxmlformats.org/officeDocument/2006/math" xmlns:v="urn:schemas-microsoft-com:vml" xmlns:wp14="http://schemas.microsoft.com/office/word/2010/wordprocessingDrawing" xmlns:wp="http://schemas.openxmlformats.org/drawingml/2006/wordprocessingDrawing" xmlns:w10="urn:schemas-microsoft-com:office:word" xmlns:w="http://schemas.openxmlformats.org/wordprocessingml/2006/main" xmlns:w14="http://schemas.microsoft.com/office/word/2010/wordml" xmlns:w15="http://schemas.microsoft.com/office/word/2012/wordml" xmlns:w16cex="http://schemas.microsoft.com/office/word/2018/wordml/cex" xmlns:w16cid="http://schemas.microsoft.com/office/word/2016/wordml/cid" xmlns:w16="http://schemas.microsoft.com/office/word/2018/wordml" xmlns:w16du="http://schemas.microsoft.com/office/word/2023/wordml/word16du" xmlns:w16sdtdh="http://schemas.microsoft.com/office/word/2020/wordml/sdtdatahash" xmlns:w16sdtfl="http://schemas.microsoft.com/office/word/2024/wordml/sdtformatlock" xmlns:w16se="http://schemas.microsoft.com/office/word/2015/wordml/symex" xmlns:wpg="http://schemas.microsoft.com/office/word/2010/wordprocessingGroup" xmlns:wpi="http://schemas.microsoft.com/office/word/2010/wordprocessingInk" xmlns:wne="http://schemas.microsoft.com/office/word/2006/wordml" xmlns:wps="http://schemas.microsoft.com/office/word/2010/wordprocessingShape" mc:Ignorable="w14 w15 w16se w16cid w16 w16cex w16sdtdh w16sdtfl w16du wp14">
   <w:p>
     <w:pPr>
@@ -873,6 +996,16 @@
 </w:ftr>
 </file>
 
+<file path=word/footer3.xml><?xml version="1.0" encoding="utf-8"?>
+<w:ftr xmlns:wpc="http://schemas.microsoft.com/office/word/2010/wordprocessingCanvas" xmlns:cx="http://schemas.microsoft.com/office/drawing/2014/chartex" xmlns:cx1="http://schemas.microsoft.com/office/drawing/2015/9/8/chartex" xmlns:cx2="http://schemas.microsoft.com/office/drawing/2015/10/21/chartex" xmlns:cx3="http://schemas.microsoft.com/office/drawing/2016/5/9/chartex" xmlns:cx4="http://schemas.microsoft.com/office/drawing/2016/5/10/chartex" xmlns:cx5="http://schemas.microsoft.com/office/drawing/2016/5/11/chartex" xmlns:cx6="http://schemas.microsoft.com/office/drawing/2016/5/12/chartex" xmlns:cx7="http://schemas.microsoft.com/office/drawing/2016/5/13/chartex" xmlns:cx8="http://schemas.microsoft.com/office/drawing/2016/5/14/chartex" xmlns:mc="http://schemas.openxmlformats.org/markup-compatibility/2006" xmlns:aink="http://schemas.microsoft.com/office/drawing/2016/ink" xmlns:am3d="http://schemas.microsoft.com/office/drawing/2017/model3d" xmlns:o="urn:schemas-microsoft-com:office:office" xmlns:oel="http://schemas.microsoft.com/office/2019/extlst" xmlns:r="http://schemas.openxmlformats.org/officeDocument/2006/relationships" xmlns:m="http://schemas.openxmlformats.org/officeDocument/2006/math" xmlns:v="urn:schemas-microsoft-com:vml" xmlns:wp14="http://schemas.microsoft.com/office/word/2010/wordprocessingDrawing" xmlns:wp="http://schemas.openxmlformats.org/drawingml/2006/wordprocessingDrawing" xmlns:w10="urn:schemas-microsoft-com:office:word" xmlns:w="http://schemas.openxmlformats.org/wordprocessingml/2006/main" xmlns:w14="http://schemas.microsoft.com/office/word/2010/wordml" xmlns:w15="http://schemas.microsoft.com/office/word/2012/wordml" xmlns:w16cex="http://schemas.microsoft.com/office/word/2018/wordml/cex" xmlns:w16cid="http://schemas.microsoft.com/office/word/2016/wordml/cid" xmlns:w16="http://schemas.microsoft.com/office/word/2018/wordml" xmlns:w16du="http://schemas.microsoft.com/office/word/2023/wordml/word16du" xmlns:w16sdtdh="http://schemas.microsoft.com/office/word/2020/wordml/sdtdatahash" xmlns:w16sdtfl="http://schemas.microsoft.com/office/word/2024/wordml/sdtformatlock" xmlns:w16se="http://schemas.microsoft.com/office/word/2015/wordml/symex" xmlns:wpg="http://schemas.microsoft.com/office/word/2010/wordprocessingGroup" xmlns:wpi="http://schemas.microsoft.com/office/word/2010/wordprocessingInk" xmlns:wne="http://schemas.microsoft.com/office/word/2006/wordml" xmlns:wps="http://schemas.microsoft.com/office/word/2010/wordprocessingShape" mc:Ignorable="w14 w15 w16se w16cid w16 w16cex w16sdtdh w16sdtfl w16du wp14">
+  <w:p>
+    <w:pPr>
+      <w:pStyle w:val="Footer"/>
+    </w:pPr>
+  </w:p>
+</w:ftr>
+</file>
+
 <file path=word/footnotes.xml><?xml version="1.0" encoding="utf-8"?>
 <w:footnotes xmlns:wpc="http://schemas.microsoft.com/office/word/2010/wordprocessingCanvas" xmlns:cx="http://schemas.microsoft.com/office/drawing/2014/chartex" xmlns:cx1="http://schemas.microsoft.com/office/drawing/2015/9/8/chartex" xmlns:cx2="http://schemas.microsoft.com/office/drawing/2015/10/21/chartex" xmlns:cx3="http://schemas.microsoft.com/office/drawing/2016/5/9/chartex" xmlns:cx4="http://schemas.microsoft.com/office/drawing/2016/5/10/chartex" xmlns:cx5="http://schemas.microsoft.com/office/drawing/2016/5/11/chartex" xmlns:cx6="http://schemas.microsoft.com/office/drawing/2016/5/12/chartex" xmlns:cx7="http://schemas.microsoft.com/office/drawing/2016/5/13/chartex" xmlns:cx8="http://schemas.microsoft.com/office/drawing/2016/5/14/chartex" xmlns:mc="http://schemas.openxmlformats.org/markup-compatibility/2006" xmlns:aink="http://schemas.microsoft.com/office/drawing/2016/ink" xmlns:am3d="http://schemas.microsoft.com/office/drawing/2017/model3d" xmlns:o="urn:schemas-microsoft-com:office:office" xmlns:oel="http://schemas.microsoft.com/office/2019/extlst" xmlns:r="http://schemas.openxmlformats.org/officeDocument/2006/relationships" xmlns:m="http://schemas.openxmlformats.org/officeDocument/2006/math" xmlns:v="urn:schemas-microsoft-com:vml" xmlns:wp14="http://schemas.microsoft.com/office/word/2010/wordprocessingDrawing" xmlns:wp="http://schemas.openxmlformats.org/drawingml/2006/wordprocessingDrawing" xmlns:w10="urn:schemas-microsoft-com:office:word" xmlns:w="http://schemas.openxmlformats.org/wordprocessingml/2006/main" xmlns:w14="http://schemas.microsoft.com/office/word/2010/wordml" xmlns:w15="http://schemas.microsoft.com/office/word/2012/wordml" xmlns:w16cex="http://schemas.microsoft.com/office/word/2018/wordml/cex" xmlns:w16cid="http://schemas.microsoft.com/office/word/2016/wordml/cid" xmlns:w16="http://schemas.microsoft.com/office/word/2018/wordml" xmlns:w16du="http://schemas.microsoft.com/office/word/2023/wordml/word16du" xmlns:w16sdtdh="http://schemas.microsoft.com/office/word/2020/wordml/sdtdatahash" xmlns:w16sdtfl="http://schemas.microsoft.com/office/word/2024/wordml/sdtformatlock" xmlns:w16se="http://schemas.microsoft.com/office/word/2015/wordml/symex" xmlns:wpg="http://schemas.microsoft.com/office/word/2010/wordprocessingGroup" xmlns:wpi="http://schemas.microsoft.com/office/word/2010/wordprocessingInk" xmlns:wne="http://schemas.microsoft.com/office/word/2006/wordml" xmlns:wps="http://schemas.microsoft.com/office/word/2010/wordprocessingShape" mc:Ignorable="w14 w15 w16se w16cid w16 w16cex w16sdtdh w16sdtfl w16du wp14">
   <w:footnote w:type="separator" w:id="-1">
@@ -893,6 +1026,16 @@
 </file>
 
 <file path=word/header1.xml><?xml version="1.0" encoding="utf-8"?>
+<w:hdr xmlns:wpc="http://schemas.microsoft.com/office/word/2010/wordprocessingCanvas" xmlns:cx="http://schemas.microsoft.com/office/drawing/2014/chartex" xmlns:cx1="http://schemas.microsoft.com/office/drawing/2015/9/8/chartex" xmlns:cx2="http://schemas.microsoft.com/office/drawing/2015/10/21/chartex" xmlns:cx3="http://schemas.microsoft.com/office/drawing/2016/5/9/chartex" xmlns:cx4="http://schemas.microsoft.com/office/drawing/2016/5/10/chartex" xmlns:cx5="http://schemas.microsoft.com/office/drawing/2016/5/11/chartex" xmlns:cx6="http://schemas.microsoft.com/office/drawing/2016/5/12/chartex" xmlns:cx7="http://schemas.microsoft.com/office/drawing/2016/5/13/chartex" xmlns:cx8="http://schemas.microsoft.com/office/drawing/2016/5/14/chartex" xmlns:mc="http://schemas.openxmlformats.org/markup-compatibility/2006" xmlns:aink="http://schemas.microsoft.com/office/drawing/2016/ink" xmlns:am3d="http://schemas.microsoft.com/office/drawing/2017/model3d" xmlns:o="urn:schemas-microsoft-com:office:office" xmlns:oel="http://schemas.microsoft.com/office/2019/extlst" xmlns:r="http://schemas.openxmlformats.org/officeDocument/2006/relationships" xmlns:m="http://schemas.openxmlformats.org/officeDocument/2006/math" xmlns:v="urn:schemas-microsoft-com:vml" xmlns:wp14="http://schemas.microsoft.com/office/word/2010/wordprocessingDrawing" xmlns:wp="http://schemas.openxmlformats.org/drawingml/2006/wordprocessingDrawing" xmlns:w10="urn:schemas-microsoft-com:office:word" xmlns:w="http://schemas.openxmlformats.org/wordprocessingml/2006/main" xmlns:w14="http://schemas.microsoft.com/office/word/2010/wordml" xmlns:w15="http://schemas.microsoft.com/office/word/2012/wordml" xmlns:w16cex="http://schemas.microsoft.com/office/word/2018/wordml/cex" xmlns:w16cid="http://schemas.microsoft.com/office/word/2016/wordml/cid" xmlns:w16="http://schemas.microsoft.com/office/word/2018/wordml" xmlns:w16du="http://schemas.microsoft.com/office/word/2023/wordml/word16du" xmlns:w16sdtdh="http://schemas.microsoft.com/office/word/2020/wordml/sdtdatahash" xmlns:w16sdtfl="http://schemas.microsoft.com/office/word/2024/wordml/sdtformatlock" xmlns:w16se="http://schemas.microsoft.com/office/word/2015/wordml/symex" xmlns:wpg="http://schemas.microsoft.com/office/word/2010/wordprocessingGroup" xmlns:wpi="http://schemas.microsoft.com/office/word/2010/wordprocessingInk" xmlns:wne="http://schemas.microsoft.com/office/word/2006/wordml" xmlns:wps="http://schemas.microsoft.com/office/word/2010/wordprocessingShape" mc:Ignorable="w14 w15 w16se w16cid w16 w16cex w16sdtdh w16sdtfl w16du wp14">
+  <w:p>
+    <w:pPr>
+      <w:pStyle w:val="Header"/>
+    </w:pPr>
+  </w:p>
+</w:hdr>
+</file>
+
+<file path=word/header2.xml><?xml version="1.0" encoding="utf-8"?>
 <w:hdr xmlns:wpc="http://schemas.microsoft.com/office/word/2010/wordprocessingCanvas" xmlns:cx="http://schemas.microsoft.com/office/drawing/2014/chartex" xmlns:cx1="http://schemas.microsoft.com/office/drawing/2015/9/8/chartex" xmlns:cx2="http://schemas.microsoft.com/office/drawing/2015/10/21/chartex" xmlns:cx3="http://schemas.microsoft.com/office/drawing/2016/5/9/chartex" xmlns:cx4="http://schemas.microsoft.com/office/drawing/2016/5/10/chartex" xmlns:cx5="http://schemas.microsoft.com/office/drawing/2016/5/11/chartex" xmlns:cx6="http://schemas.microsoft.com/office/drawing/2016/5/12/chartex" xmlns:cx7="http://schemas.microsoft.com/office/drawing/2016/5/13/chartex" xmlns:cx8="http://schemas.microsoft.com/office/drawing/2016/5/14/chartex" xmlns:mc="http://schemas.openxmlformats.org/markup-compatibility/2006" xmlns:aink="http://schemas.microsoft.com/office/drawing/2016/ink" xmlns:am3d="http://schemas.microsoft.com/office/drawing/2017/model3d" xmlns:o="urn:schemas-microsoft-com:office:office" xmlns:oel="http://schemas.microsoft.com/office/2019/extlst" xmlns:r="http://schemas.openxmlformats.org/officeDocument/2006/relationships" xmlns:m="http://schemas.openxmlformats.org/officeDocument/2006/math" xmlns:v="urn:schemas-microsoft-com:vml" xmlns:wp14="http://schemas.microsoft.com/office/word/2010/wordprocessingDrawing" xmlns:wp="http://schemas.openxmlformats.org/drawingml/2006/wordprocessingDrawing" xmlns:w10="urn:schemas-microsoft-com:office:word" xmlns:w="http://schemas.openxmlformats.org/wordprocessingml/2006/main" xmlns:w14="http://schemas.microsoft.com/office/word/2010/wordml" xmlns:w15="http://schemas.microsoft.com/office/word/2012/wordml" xmlns:w16cex="http://schemas.microsoft.com/office/word/2018/wordml/cex" xmlns:w16cid="http://schemas.microsoft.com/office/word/2016/wordml/cid" xmlns:w16="http://schemas.microsoft.com/office/word/2018/wordml" xmlns:w16du="http://schemas.microsoft.com/office/word/2023/wordml/word16du" xmlns:w16sdtdh="http://schemas.microsoft.com/office/word/2020/wordml/sdtdatahash" xmlns:w16sdtfl="http://schemas.microsoft.com/office/word/2024/wordml/sdtformatlock" xmlns:w16se="http://schemas.microsoft.com/office/word/2015/wordml/symex" xmlns:wpg="http://schemas.microsoft.com/office/word/2010/wordprocessingGroup" xmlns:wpi="http://schemas.microsoft.com/office/word/2010/wordprocessingInk" xmlns:wne="http://schemas.microsoft.com/office/word/2006/wordml" xmlns:wps="http://schemas.microsoft.com/office/word/2010/wordprocessingShape" mc:Ignorable="w14 w15 w16se w16cid w16 w16cex w16sdtdh w16sdtfl w16du wp14">
   <w:p>
     <w:pPr>
@@ -910,7 +1053,7 @@
 </w:hdr>
 </file>
 
-<file path=word/header2.xml><?xml version="1.0" encoding="utf-8"?>
+<file path=word/header3.xml><?xml version="1.0" encoding="utf-8"?>
 <w:hdr xmlns:wpc="http://schemas.microsoft.com/office/word/2010/wordprocessingCanvas" xmlns:cx="http://schemas.microsoft.com/office/drawing/2014/chartex" xmlns:cx1="http://schemas.microsoft.com/office/drawing/2015/9/8/chartex" xmlns:cx2="http://schemas.microsoft.com/office/drawing/2015/10/21/chartex" xmlns:cx3="http://schemas.microsoft.com/office/drawing/2016/5/9/chartex" xmlns:cx4="http://schemas.microsoft.com/office/drawing/2016/5/10/chartex" xmlns:cx5="http://schemas.microsoft.com/office/drawing/2016/5/11/chartex" xmlns:cx6="http://schemas.microsoft.com/office/drawing/2016/5/12/chartex" xmlns:cx7="http://schemas.microsoft.com/office/drawing/2016/5/13/chartex" xmlns:cx8="http://schemas.microsoft.com/office/drawing/2016/5/14/chartex" xmlns:mc="http://schemas.openxmlformats.org/markup-compatibility/2006" xmlns:aink="http://schemas.microsoft.com/office/drawing/2016/ink" xmlns:am3d="http://schemas.microsoft.com/office/drawing/2017/model3d" xmlns:o="urn:schemas-microsoft-com:office:office" xmlns:oel="http://schemas.microsoft.com/office/2019/extlst" xmlns:r="http://schemas.openxmlformats.org/officeDocument/2006/relationships" xmlns:m="http://schemas.openxmlformats.org/officeDocument/2006/math" xmlns:v="urn:schemas-microsoft-com:vml" xmlns:wp14="http://schemas.microsoft.com/office/word/2010/wordprocessingDrawing" xmlns:wp="http://schemas.openxmlformats.org/drawingml/2006/wordprocessingDrawing" xmlns:w10="urn:schemas-microsoft-com:office:word" xmlns:w="http://schemas.openxmlformats.org/wordprocessingml/2006/main" xmlns:w14="http://schemas.microsoft.com/office/word/2010/wordml" xmlns:w15="http://schemas.microsoft.com/office/word/2012/wordml" xmlns:w16cex="http://schemas.microsoft.com/office/word/2018/wordml/cex" xmlns:w16cid="http://schemas.microsoft.com/office/word/2016/wordml/cid" xmlns:w16="http://schemas.microsoft.com/office/word/2018/wordml" xmlns:w16du="http://schemas.microsoft.com/office/word/2023/wordml/word16du" xmlns:w16sdtdh="http://schemas.microsoft.com/office/word/2020/wordml/sdtdatahash" xmlns:w16sdtfl="http://schemas.microsoft.com/office/word/2024/wordml/sdtformatlock" xmlns:w16se="http://schemas.microsoft.com/office/word/2015/wordml/symex" xmlns:wpg="http://schemas.microsoft.com/office/word/2010/wordprocessingGroup" xmlns:wpi="http://schemas.microsoft.com/office/word/2010/wordprocessingInk" xmlns:wne="http://schemas.microsoft.com/office/word/2006/wordml" xmlns:wps="http://schemas.microsoft.com/office/word/2010/wordprocessingShape" mc:Ignorable="w14 w15 w16se w16cid w16 w16cex w16sdtdh w16sdtfl w16du wp14">
   <w:p>
     <w:pPr>
@@ -1040,7 +1183,7 @@
     <w:lsdException w:name="E-mail Signature" w:semiHidden="1" w:unhideWhenUsed="1"/>
     <w:lsdException w:name="HTML Top of Form" w:semiHidden="1" w:unhideWhenUsed="1"/>
     <w:lsdException w:name="HTML Bottom of Form" w:semiHidden="1" w:unhideWhenUsed="1"/>
-    <w:lsdException w:name="Normal (Web)" w:semiHidden="1" w:unhideWhenUsed="1"/>
+    <w:lsdException w:name="Normal (Web)" w:semiHidden="1" w:uiPriority="99" w:unhideWhenUsed="1"/>
     <w:lsdException w:name="HTML Acronym" w:semiHidden="1" w:unhideWhenUsed="1"/>
     <w:lsdException w:name="HTML Address" w:semiHidden="1" w:unhideWhenUsed="1"/>
     <w:lsdException w:name="HTML Cite" w:semiHidden="1" w:unhideWhenUsed="1"/>
@@ -1327,6 +1470,200 @@
     <w:qFormat/>
     <w:rsid w:val="00753C40"/>
   </w:style>
+  <w:style w:type="paragraph" w:styleId="Heading1">
+    <w:name w:val="heading 1"/>
+    <w:basedOn w:val="Normal"/>
+    <w:next w:val="Normal"/>
+    <w:link w:val="Heading1Char"/>
+    <w:qFormat/>
+    <w:rsid w:val="004C62E3"/>
+    <w:pPr>
+      <w:keepNext/>
+      <w:keepLines/>
+      <w:spacing w:before="240"/>
+      <w:outlineLvl w:val="0"/>
+    </w:pPr>
+    <w:rPr>
+      <w:rFonts w:asciiTheme="majorHAnsi" w:eastAsiaTheme="majorEastAsia" w:hAnsiTheme="majorHAnsi" w:cstheme="majorBidi"/>
+      <w:color w:val="365F91" w:themeColor="accent1" w:themeShade="BF"/>
+      <w:sz w:val="32"/>
+      <w:szCs w:val="32"/>
+    </w:rPr>
+  </w:style>
+  <w:style w:type="paragraph" w:styleId="Heading2">
+    <w:name w:val="heading 2"/>
+    <w:basedOn w:val="Normal"/>
+    <w:next w:val="Normal"/>
+    <w:link w:val="Heading2Char"/>
+    <w:semiHidden/>
+    <w:unhideWhenUsed/>
+    <w:qFormat/>
+    <w:rsid w:val="004C62E3"/>
+    <w:pPr>
+      <w:keepNext/>
+      <w:keepLines/>
+      <w:spacing w:before="40"/>
+      <w:outlineLvl w:val="1"/>
+    </w:pPr>
+    <w:rPr>
+      <w:rFonts w:asciiTheme="majorHAnsi" w:eastAsiaTheme="majorEastAsia" w:hAnsiTheme="majorHAnsi" w:cstheme="majorBidi"/>
+      <w:color w:val="365F91" w:themeColor="accent1" w:themeShade="BF"/>
+      <w:sz w:val="26"/>
+      <w:szCs w:val="26"/>
+    </w:rPr>
+  </w:style>
+  <w:style w:type="paragraph" w:styleId="Heading3">
+    <w:name w:val="heading 3"/>
+    <w:basedOn w:val="Normal"/>
+    <w:next w:val="Normal"/>
+    <w:link w:val="Heading3Char"/>
+    <w:semiHidden/>
+    <w:unhideWhenUsed/>
+    <w:qFormat/>
+    <w:rsid w:val="004C62E3"/>
+    <w:pPr>
+      <w:keepNext/>
+      <w:keepLines/>
+      <w:spacing w:before="40"/>
+      <w:outlineLvl w:val="2"/>
+    </w:pPr>
+    <w:rPr>
+      <w:rFonts w:asciiTheme="majorHAnsi" w:eastAsiaTheme="majorEastAsia" w:hAnsiTheme="majorHAnsi" w:cstheme="majorBidi"/>
+      <w:color w:val="243F60" w:themeColor="accent1" w:themeShade="7F"/>
+      <w:sz w:val="24"/>
+      <w:szCs w:val="24"/>
+    </w:rPr>
+  </w:style>
+  <w:style w:type="paragraph" w:styleId="Heading4">
+    <w:name w:val="heading 4"/>
+    <w:basedOn w:val="Normal"/>
+    <w:next w:val="Normal"/>
+    <w:link w:val="Heading4Char"/>
+    <w:semiHidden/>
+    <w:unhideWhenUsed/>
+    <w:qFormat/>
+    <w:rsid w:val="004C62E3"/>
+    <w:pPr>
+      <w:keepNext/>
+      <w:keepLines/>
+      <w:spacing w:before="40"/>
+      <w:outlineLvl w:val="3"/>
+    </w:pPr>
+    <w:rPr>
+      <w:rFonts w:asciiTheme="majorHAnsi" w:eastAsiaTheme="majorEastAsia" w:hAnsiTheme="majorHAnsi" w:cstheme="majorBidi"/>
+      <w:i/>
+      <w:iCs/>
+      <w:color w:val="365F91" w:themeColor="accent1" w:themeShade="BF"/>
+    </w:rPr>
+  </w:style>
+  <w:style w:type="paragraph" w:styleId="Heading5">
+    <w:name w:val="heading 5"/>
+    <w:basedOn w:val="Normal"/>
+    <w:next w:val="Normal"/>
+    <w:link w:val="Heading5Char"/>
+    <w:semiHidden/>
+    <w:unhideWhenUsed/>
+    <w:qFormat/>
+    <w:rsid w:val="004C62E3"/>
+    <w:pPr>
+      <w:keepNext/>
+      <w:keepLines/>
+      <w:spacing w:before="40"/>
+      <w:outlineLvl w:val="4"/>
+    </w:pPr>
+    <w:rPr>
+      <w:rFonts w:asciiTheme="majorHAnsi" w:eastAsiaTheme="majorEastAsia" w:hAnsiTheme="majorHAnsi" w:cstheme="majorBidi"/>
+      <w:color w:val="365F91" w:themeColor="accent1" w:themeShade="BF"/>
+    </w:rPr>
+  </w:style>
+  <w:style w:type="paragraph" w:styleId="Heading6">
+    <w:name w:val="heading 6"/>
+    <w:basedOn w:val="Normal"/>
+    <w:next w:val="Normal"/>
+    <w:link w:val="Heading6Char"/>
+    <w:semiHidden/>
+    <w:unhideWhenUsed/>
+    <w:qFormat/>
+    <w:rsid w:val="004C62E3"/>
+    <w:pPr>
+      <w:keepNext/>
+      <w:keepLines/>
+      <w:spacing w:before="40"/>
+      <w:outlineLvl w:val="5"/>
+    </w:pPr>
+    <w:rPr>
+      <w:rFonts w:asciiTheme="majorHAnsi" w:eastAsiaTheme="majorEastAsia" w:hAnsiTheme="majorHAnsi" w:cstheme="majorBidi"/>
+      <w:color w:val="243F60" w:themeColor="accent1" w:themeShade="7F"/>
+    </w:rPr>
+  </w:style>
+  <w:style w:type="paragraph" w:styleId="Heading7">
+    <w:name w:val="heading 7"/>
+    <w:basedOn w:val="Normal"/>
+    <w:next w:val="Normal"/>
+    <w:link w:val="Heading7Char"/>
+    <w:semiHidden/>
+    <w:unhideWhenUsed/>
+    <w:qFormat/>
+    <w:rsid w:val="004C62E3"/>
+    <w:pPr>
+      <w:keepNext/>
+      <w:keepLines/>
+      <w:spacing w:before="40"/>
+      <w:outlineLvl w:val="6"/>
+    </w:pPr>
+    <w:rPr>
+      <w:rFonts w:asciiTheme="majorHAnsi" w:eastAsiaTheme="majorEastAsia" w:hAnsiTheme="majorHAnsi" w:cstheme="majorBidi"/>
+      <w:i/>
+      <w:iCs/>
+      <w:color w:val="243F60" w:themeColor="accent1" w:themeShade="7F"/>
+    </w:rPr>
+  </w:style>
+  <w:style w:type="paragraph" w:styleId="Heading8">
+    <w:name w:val="heading 8"/>
+    <w:basedOn w:val="Normal"/>
+    <w:next w:val="Normal"/>
+    <w:link w:val="Heading8Char"/>
+    <w:semiHidden/>
+    <w:unhideWhenUsed/>
+    <w:qFormat/>
+    <w:rsid w:val="004C62E3"/>
+    <w:pPr>
+      <w:keepNext/>
+      <w:keepLines/>
+      <w:spacing w:before="40"/>
+      <w:outlineLvl w:val="7"/>
+    </w:pPr>
+    <w:rPr>
+      <w:rFonts w:asciiTheme="majorHAnsi" w:eastAsiaTheme="majorEastAsia" w:hAnsiTheme="majorHAnsi" w:cstheme="majorBidi"/>
+      <w:color w:val="272727" w:themeColor="text1" w:themeTint="D8"/>
+      <w:sz w:val="21"/>
+      <w:szCs w:val="21"/>
+    </w:rPr>
+  </w:style>
+  <w:style w:type="paragraph" w:styleId="Heading9">
+    <w:name w:val="heading 9"/>
+    <w:basedOn w:val="Normal"/>
+    <w:next w:val="Normal"/>
+    <w:link w:val="Heading9Char"/>
+    <w:semiHidden/>
+    <w:unhideWhenUsed/>
+    <w:qFormat/>
+    <w:rsid w:val="004C62E3"/>
+    <w:pPr>
+      <w:keepNext/>
+      <w:keepLines/>
+      <w:spacing w:before="40"/>
+      <w:outlineLvl w:val="8"/>
+    </w:pPr>
+    <w:rPr>
+      <w:rFonts w:asciiTheme="majorHAnsi" w:eastAsiaTheme="majorEastAsia" w:hAnsiTheme="majorHAnsi" w:cstheme="majorBidi"/>
+      <w:i/>
+      <w:iCs/>
+      <w:color w:val="272727" w:themeColor="text1" w:themeTint="D8"/>
+      <w:sz w:val="21"/>
+      <w:szCs w:val="21"/>
+    </w:rPr>
+  </w:style>
   <w:style w:type="character" w:default="1" w:styleId="DefaultParagraphFont">
     <w:name w:val="Default Paragraph Font"/>
     <w:uiPriority w:val="1"/>
@@ -1518,6 +1855,360 @@
       <w:spacing w:val="15"/>
       <w:sz w:val="22"/>
       <w:szCs w:val="22"/>
+    </w:rPr>
+  </w:style>
+  <w:style w:type="character" w:styleId="BookTitle">
+    <w:name w:val="Book Title"/>
+    <w:basedOn w:val="DefaultParagraphFont"/>
+    <w:uiPriority w:val="33"/>
+    <w:qFormat/>
+    <w:rsid w:val="004C62E3"/>
+    <w:rPr>
+      <w:b/>
+      <w:bCs/>
+      <w:i/>
+      <w:iCs/>
+      <w:spacing w:val="5"/>
+    </w:rPr>
+  </w:style>
+  <w:style w:type="paragraph" w:styleId="Caption">
+    <w:name w:val="caption"/>
+    <w:basedOn w:val="Normal"/>
+    <w:next w:val="Normal"/>
+    <w:semiHidden/>
+    <w:unhideWhenUsed/>
+    <w:qFormat/>
+    <w:rsid w:val="004C62E3"/>
+    <w:pPr>
+      <w:spacing w:after="200"/>
+    </w:pPr>
+    <w:rPr>
+      <w:i/>
+      <w:iCs/>
+      <w:color w:val="1F497D" w:themeColor="text2"/>
+      <w:sz w:val="18"/>
+      <w:szCs w:val="18"/>
+    </w:rPr>
+  </w:style>
+  <w:style w:type="character" w:styleId="Emphasis">
+    <w:name w:val="Emphasis"/>
+    <w:basedOn w:val="DefaultParagraphFont"/>
+    <w:qFormat/>
+    <w:rsid w:val="004C62E3"/>
+    <w:rPr>
+      <w:i/>
+      <w:iCs/>
+    </w:rPr>
+  </w:style>
+  <w:style w:type="character" w:customStyle="1" w:styleId="Heading1Char">
+    <w:name w:val="Heading 1 Char"/>
+    <w:basedOn w:val="DefaultParagraphFont"/>
+    <w:link w:val="Heading1"/>
+    <w:rsid w:val="004C62E3"/>
+    <w:rPr>
+      <w:rFonts w:asciiTheme="majorHAnsi" w:eastAsiaTheme="majorEastAsia" w:hAnsiTheme="majorHAnsi" w:cstheme="majorBidi"/>
+      <w:color w:val="365F91" w:themeColor="accent1" w:themeShade="BF"/>
+      <w:sz w:val="32"/>
+      <w:szCs w:val="32"/>
+    </w:rPr>
+  </w:style>
+  <w:style w:type="character" w:customStyle="1" w:styleId="Heading2Char">
+    <w:name w:val="Heading 2 Char"/>
+    <w:basedOn w:val="DefaultParagraphFont"/>
+    <w:link w:val="Heading2"/>
+    <w:semiHidden/>
+    <w:rsid w:val="004C62E3"/>
+    <w:rPr>
+      <w:rFonts w:asciiTheme="majorHAnsi" w:eastAsiaTheme="majorEastAsia" w:hAnsiTheme="majorHAnsi" w:cstheme="majorBidi"/>
+      <w:color w:val="365F91" w:themeColor="accent1" w:themeShade="BF"/>
+      <w:sz w:val="26"/>
+      <w:szCs w:val="26"/>
+    </w:rPr>
+  </w:style>
+  <w:style w:type="character" w:customStyle="1" w:styleId="Heading3Char">
+    <w:name w:val="Heading 3 Char"/>
+    <w:basedOn w:val="DefaultParagraphFont"/>
+    <w:link w:val="Heading3"/>
+    <w:semiHidden/>
+    <w:rsid w:val="004C62E3"/>
+    <w:rPr>
+      <w:rFonts w:asciiTheme="majorHAnsi" w:eastAsiaTheme="majorEastAsia" w:hAnsiTheme="majorHAnsi" w:cstheme="majorBidi"/>
+      <w:color w:val="243F60" w:themeColor="accent1" w:themeShade="7F"/>
+      <w:sz w:val="24"/>
+      <w:szCs w:val="24"/>
+    </w:rPr>
+  </w:style>
+  <w:style w:type="character" w:customStyle="1" w:styleId="Heading4Char">
+    <w:name w:val="Heading 4 Char"/>
+    <w:basedOn w:val="DefaultParagraphFont"/>
+    <w:link w:val="Heading4"/>
+    <w:semiHidden/>
+    <w:rsid w:val="004C62E3"/>
+    <w:rPr>
+      <w:rFonts w:asciiTheme="majorHAnsi" w:eastAsiaTheme="majorEastAsia" w:hAnsiTheme="majorHAnsi" w:cstheme="majorBidi"/>
+      <w:i/>
+      <w:iCs/>
+      <w:color w:val="365F91" w:themeColor="accent1" w:themeShade="BF"/>
+    </w:rPr>
+  </w:style>
+  <w:style w:type="character" w:customStyle="1" w:styleId="Heading5Char">
+    <w:name w:val="Heading 5 Char"/>
+    <w:basedOn w:val="DefaultParagraphFont"/>
+    <w:link w:val="Heading5"/>
+    <w:semiHidden/>
+    <w:rsid w:val="004C62E3"/>
+    <w:rPr>
+      <w:rFonts w:asciiTheme="majorHAnsi" w:eastAsiaTheme="majorEastAsia" w:hAnsiTheme="majorHAnsi" w:cstheme="majorBidi"/>
+      <w:color w:val="365F91" w:themeColor="accent1" w:themeShade="BF"/>
+    </w:rPr>
+  </w:style>
+  <w:style w:type="character" w:customStyle="1" w:styleId="Heading6Char">
+    <w:name w:val="Heading 6 Char"/>
+    <w:basedOn w:val="DefaultParagraphFont"/>
+    <w:link w:val="Heading6"/>
+    <w:semiHidden/>
+    <w:rsid w:val="004C62E3"/>
+    <w:rPr>
+      <w:rFonts w:asciiTheme="majorHAnsi" w:eastAsiaTheme="majorEastAsia" w:hAnsiTheme="majorHAnsi" w:cstheme="majorBidi"/>
+      <w:color w:val="243F60" w:themeColor="accent1" w:themeShade="7F"/>
+    </w:rPr>
+  </w:style>
+  <w:style w:type="character" w:customStyle="1" w:styleId="Heading7Char">
+    <w:name w:val="Heading 7 Char"/>
+    <w:basedOn w:val="DefaultParagraphFont"/>
+    <w:link w:val="Heading7"/>
+    <w:semiHidden/>
+    <w:rsid w:val="004C62E3"/>
+    <w:rPr>
+      <w:rFonts w:asciiTheme="majorHAnsi" w:eastAsiaTheme="majorEastAsia" w:hAnsiTheme="majorHAnsi" w:cstheme="majorBidi"/>
+      <w:i/>
+      <w:iCs/>
+      <w:color w:val="243F60" w:themeColor="accent1" w:themeShade="7F"/>
+    </w:rPr>
+  </w:style>
+  <w:style w:type="character" w:customStyle="1" w:styleId="Heading8Char">
+    <w:name w:val="Heading 8 Char"/>
+    <w:basedOn w:val="DefaultParagraphFont"/>
+    <w:link w:val="Heading8"/>
+    <w:semiHidden/>
+    <w:rsid w:val="004C62E3"/>
+    <w:rPr>
+      <w:rFonts w:asciiTheme="majorHAnsi" w:eastAsiaTheme="majorEastAsia" w:hAnsiTheme="majorHAnsi" w:cstheme="majorBidi"/>
+      <w:color w:val="272727" w:themeColor="text1" w:themeTint="D8"/>
+      <w:sz w:val="21"/>
+      <w:szCs w:val="21"/>
+    </w:rPr>
+  </w:style>
+  <w:style w:type="character" w:customStyle="1" w:styleId="Heading9Char">
+    <w:name w:val="Heading 9 Char"/>
+    <w:basedOn w:val="DefaultParagraphFont"/>
+    <w:link w:val="Heading9"/>
+    <w:semiHidden/>
+    <w:rsid w:val="004C62E3"/>
+    <w:rPr>
+      <w:rFonts w:asciiTheme="majorHAnsi" w:eastAsiaTheme="majorEastAsia" w:hAnsiTheme="majorHAnsi" w:cstheme="majorBidi"/>
+      <w:i/>
+      <w:iCs/>
+      <w:color w:val="272727" w:themeColor="text1" w:themeTint="D8"/>
+      <w:sz w:val="21"/>
+      <w:szCs w:val="21"/>
+    </w:rPr>
+  </w:style>
+  <w:style w:type="character" w:styleId="IntenseEmphasis">
+    <w:name w:val="Intense Emphasis"/>
+    <w:basedOn w:val="DefaultParagraphFont"/>
+    <w:uiPriority w:val="21"/>
+    <w:qFormat/>
+    <w:rsid w:val="004C62E3"/>
+    <w:rPr>
+      <w:i/>
+      <w:iCs/>
+      <w:color w:val="4F81BD" w:themeColor="accent1"/>
+    </w:rPr>
+  </w:style>
+  <w:style w:type="paragraph" w:styleId="IntenseQuote">
+    <w:name w:val="Intense Quote"/>
+    <w:basedOn w:val="Normal"/>
+    <w:next w:val="Normal"/>
+    <w:link w:val="IntenseQuoteChar"/>
+    <w:uiPriority w:val="30"/>
+    <w:qFormat/>
+    <w:rsid w:val="004C62E3"/>
+    <w:pPr>
+      <w:pBdr>
+        <w:top w:val="single" w:sz="4" w:space="10" w:color="4F81BD" w:themeColor="accent1"/>
+        <w:bottom w:val="single" w:sz="4" w:space="10" w:color="4F81BD" w:themeColor="accent1"/>
+      </w:pBdr>
+      <w:spacing w:before="360" w:after="360"/>
+      <w:ind w:left="864" w:right="864"/>
+      <w:jc w:val="center"/>
+    </w:pPr>
+    <w:rPr>
+      <w:i/>
+      <w:iCs/>
+      <w:color w:val="4F81BD" w:themeColor="accent1"/>
+    </w:rPr>
+  </w:style>
+  <w:style w:type="character" w:customStyle="1" w:styleId="IntenseQuoteChar">
+    <w:name w:val="Intense Quote Char"/>
+    <w:basedOn w:val="DefaultParagraphFont"/>
+    <w:link w:val="IntenseQuote"/>
+    <w:uiPriority w:val="30"/>
+    <w:rsid w:val="004C62E3"/>
+    <w:rPr>
+      <w:i/>
+      <w:iCs/>
+      <w:color w:val="4F81BD" w:themeColor="accent1"/>
+    </w:rPr>
+  </w:style>
+  <w:style w:type="character" w:styleId="IntenseReference">
+    <w:name w:val="Intense Reference"/>
+    <w:basedOn w:val="DefaultParagraphFont"/>
+    <w:uiPriority w:val="32"/>
+    <w:qFormat/>
+    <w:rsid w:val="004C62E3"/>
+    <w:rPr>
+      <w:b/>
+      <w:bCs/>
+      <w:smallCaps/>
+      <w:color w:val="4F81BD" w:themeColor="accent1"/>
+      <w:spacing w:val="5"/>
+    </w:rPr>
+  </w:style>
+  <w:style w:type="paragraph" w:styleId="ListParagraph">
+    <w:name w:val="List Paragraph"/>
+    <w:basedOn w:val="Normal"/>
+    <w:uiPriority w:val="34"/>
+    <w:qFormat/>
+    <w:rsid w:val="004C62E3"/>
+    <w:pPr>
+      <w:ind w:left="720"/>
+      <w:contextualSpacing/>
+    </w:pPr>
+  </w:style>
+  <w:style w:type="paragraph" w:styleId="Quote">
+    <w:name w:val="Quote"/>
+    <w:basedOn w:val="Normal"/>
+    <w:next w:val="Normal"/>
+    <w:link w:val="QuoteChar"/>
+    <w:uiPriority w:val="29"/>
+    <w:qFormat/>
+    <w:rsid w:val="004C62E3"/>
+    <w:pPr>
+      <w:spacing w:before="200" w:after="160"/>
+      <w:ind w:left="864" w:right="864"/>
+      <w:jc w:val="center"/>
+    </w:pPr>
+    <w:rPr>
+      <w:i/>
+      <w:iCs/>
+      <w:color w:val="404040" w:themeColor="text1" w:themeTint="BF"/>
+    </w:rPr>
+  </w:style>
+  <w:style w:type="character" w:customStyle="1" w:styleId="QuoteChar">
+    <w:name w:val="Quote Char"/>
+    <w:basedOn w:val="DefaultParagraphFont"/>
+    <w:link w:val="Quote"/>
+    <w:uiPriority w:val="29"/>
+    <w:rsid w:val="004C62E3"/>
+    <w:rPr>
+      <w:i/>
+      <w:iCs/>
+      <w:color w:val="404040" w:themeColor="text1" w:themeTint="BF"/>
+    </w:rPr>
+  </w:style>
+  <w:style w:type="character" w:styleId="Strong">
+    <w:name w:val="Strong"/>
+    <w:basedOn w:val="DefaultParagraphFont"/>
+    <w:qFormat/>
+    <w:rsid w:val="004C62E3"/>
+    <w:rPr>
+      <w:b/>
+      <w:bCs/>
+    </w:rPr>
+  </w:style>
+  <w:style w:type="character" w:styleId="SubtleEmphasis">
+    <w:name w:val="Subtle Emphasis"/>
+    <w:basedOn w:val="DefaultParagraphFont"/>
+    <w:uiPriority w:val="19"/>
+    <w:qFormat/>
+    <w:rsid w:val="004C62E3"/>
+    <w:rPr>
+      <w:i/>
+      <w:iCs/>
+      <w:color w:val="404040" w:themeColor="text1" w:themeTint="BF"/>
+    </w:rPr>
+  </w:style>
+  <w:style w:type="character" w:styleId="SubtleReference">
+    <w:name w:val="Subtle Reference"/>
+    <w:basedOn w:val="DefaultParagraphFont"/>
+    <w:uiPriority w:val="31"/>
+    <w:qFormat/>
+    <w:rsid w:val="004C62E3"/>
+    <w:rPr>
+      <w:smallCaps/>
+      <w:color w:val="5A5A5A" w:themeColor="text1" w:themeTint="A5"/>
+    </w:rPr>
+  </w:style>
+  <w:style w:type="paragraph" w:styleId="Title">
+    <w:name w:val="Title"/>
+    <w:basedOn w:val="Normal"/>
+    <w:next w:val="Normal"/>
+    <w:link w:val="TitleChar"/>
+    <w:qFormat/>
+    <w:rsid w:val="004C62E3"/>
+    <w:pPr>
+      <w:contextualSpacing/>
+    </w:pPr>
+    <w:rPr>
+      <w:rFonts w:asciiTheme="majorHAnsi" w:eastAsiaTheme="majorEastAsia" w:hAnsiTheme="majorHAnsi" w:cstheme="majorBidi"/>
+      <w:spacing w:val="-10"/>
+      <w:kern w:val="28"/>
+      <w:sz w:val="56"/>
+      <w:szCs w:val="56"/>
+    </w:rPr>
+  </w:style>
+  <w:style w:type="character" w:customStyle="1" w:styleId="TitleChar">
+    <w:name w:val="Title Char"/>
+    <w:basedOn w:val="DefaultParagraphFont"/>
+    <w:link w:val="Title"/>
+    <w:rsid w:val="004C62E3"/>
+    <w:rPr>
+      <w:rFonts w:asciiTheme="majorHAnsi" w:eastAsiaTheme="majorEastAsia" w:hAnsiTheme="majorHAnsi" w:cstheme="majorBidi"/>
+      <w:spacing w:val="-10"/>
+      <w:kern w:val="28"/>
+      <w:sz w:val="56"/>
+      <w:szCs w:val="56"/>
+    </w:rPr>
+  </w:style>
+  <w:style w:type="paragraph" w:styleId="TOCHeading">
+    <w:name w:val="TOC Heading"/>
+    <w:basedOn w:val="Heading1"/>
+    <w:next w:val="Normal"/>
+    <w:uiPriority w:val="39"/>
+    <w:semiHidden/>
+    <w:unhideWhenUsed/>
+    <w:qFormat/>
+    <w:rsid w:val="004C62E3"/>
+    <w:pPr>
+      <w:outlineLvl w:val="9"/>
+    </w:pPr>
+  </w:style>
+  <w:style w:type="paragraph" w:styleId="NormalWeb">
+    <w:name w:val="Normal (Web)"/>
+    <w:basedOn w:val="Normal"/>
+    <w:uiPriority w:val="99"/>
+    <w:semiHidden/>
+    <w:unhideWhenUsed/>
+    <w:rsid w:val="006B63AB"/>
+    <w:pPr>
+      <w:spacing w:before="100" w:beforeAutospacing="1" w:after="100" w:afterAutospacing="1"/>
+    </w:pPr>
+    <w:rPr>
+      <w:kern w:val="2"/>
+      <w:sz w:val="24"/>
+      <w:szCs w:val="24"/>
+      <w14:ligatures w14:val="standardContextual"/>
     </w:rPr>
   </w:style>
 </w:styles>
@@ -1809,15 +2500,6 @@
 </file>
 
 <file path=customXml/item1.xml><?xml version="1.0" encoding="utf-8"?>
-<?mso-contentType ?>
-<FormTemplates xmlns="http://schemas.microsoft.com/sharepoint/v3/contenttype/forms">
-  <Display>DocumentLibraryForm</Display>
-  <Edit>DocumentLibraryForm</Edit>
-  <New>DocumentLibraryForm</New>
-</FormTemplates>
-</file>
-
-<file path=customXml/item2.xml><?xml version="1.0" encoding="utf-8"?>
 <ct:contentTypeSchema xmlns:ct="http://schemas.microsoft.com/office/2006/metadata/contentType" xmlns:ma="http://schemas.microsoft.com/office/2006/metadata/properties/metaAttributes" ct:_="" ma:_="" ma:contentTypeName="Document" ma:contentTypeID="0x010100E9531DC6A10F464B89F6544AEE7A5B31" ma:contentTypeVersion="6" ma:contentTypeDescription="Create a new document." ma:contentTypeScope="" ma:versionID="a19b01ecd42131d53fbc93d4e8b4405f">
   <xsd:schema xmlns:xsd="http://www.w3.org/2001/XMLSchema" xmlns:xs="http://www.w3.org/2001/XMLSchema" xmlns:p="http://schemas.microsoft.com/office/2006/metadata/properties" xmlns:ns2="06495c1e-0b89-4543-a0b9-30024fab14e7" xmlns:ns3="f77a0f52-3b1d-4bfc-b86f-2a4dba093020" targetNamespace="http://schemas.microsoft.com/office/2006/metadata/properties" ma:root="true" ma:fieldsID="06c646b895491238d698e08868766b53" ns2:_="" ns3:_="">
     <xsd:import namespace="06495c1e-0b89-4543-a0b9-30024fab14e7"/>
@@ -1982,25 +2664,26 @@
 </ct:contentTypeSchema>
 </file>
 
-<file path=customXml/item3.xml><?xml version="1.0" encoding="utf-8"?>
-<b:Sources xmlns:b="http://schemas.openxmlformats.org/officeDocument/2006/bibliography" xmlns="http://schemas.openxmlformats.org/officeDocument/2006/bibliography" SelectedStyle="\APASixthEditionOfficeOnline.xsl" StyleName="APA" Version="6"/>
+<file path=customXml/item2.xml><?xml version="1.0" encoding="utf-8"?>
+<?mso-contentType ?>
+<FormTemplates xmlns="http://schemas.microsoft.com/sharepoint/v3/contenttype/forms">
+  <Display>DocumentLibraryForm</Display>
+  <Edit>DocumentLibraryForm</Edit>
+  <New>DocumentLibraryForm</New>
+</FormTemplates>
 </file>
 
-<file path=customXml/item4.xml><?xml version="1.0" encoding="utf-8"?>
+<file path=customXml/item3.xml><?xml version="1.0" encoding="utf-8"?>
 <p:properties xmlns:p="http://schemas.microsoft.com/office/2006/metadata/properties" xmlns:xsi="http://www.w3.org/2001/XMLSchema-instance" xmlns:pc="http://schemas.microsoft.com/office/infopath/2007/PartnerControls">
   <documentManagement/>
 </p:properties>
 </file>
 
-<file path=customXml/itemProps1.xml><?xml version="1.0" encoding="utf-8"?>
-<ds:datastoreItem xmlns:ds="http://schemas.openxmlformats.org/officeDocument/2006/customXml" ds:itemID="{AE6E4666-AC04-4DCD-91DD-2E7D024D2C6A}">
-  <ds:schemaRefs>
-    <ds:schemaRef ds:uri="http://schemas.microsoft.com/sharepoint/v3/contenttype/forms"/>
-  </ds:schemaRefs>
-</ds:datastoreItem>
+<file path=customXml/item4.xml><?xml version="1.0" encoding="utf-8"?>
+<b:Sources xmlns:b="http://schemas.openxmlformats.org/officeDocument/2006/bibliography" xmlns="http://schemas.openxmlformats.org/officeDocument/2006/bibliography" SelectedStyle="\APASixthEditionOfficeOnline.xsl" StyleName="APA" Version="6"/>
 </file>
 
-<file path=customXml/itemProps2.xml><?xml version="1.0" encoding="utf-8"?>
+<file path=customXml/itemProps1.xml><?xml version="1.0" encoding="utf-8"?>
 <ds:datastoreItem xmlns:ds="http://schemas.openxmlformats.org/officeDocument/2006/customXml" ds:itemID="{5F729BB4-5E63-4F8C-B3AC-5AFF0AB3D0DC}">
   <ds:schemaRefs>
     <ds:schemaRef ds:uri="http://schemas.microsoft.com/office/2006/metadata/contentType"/>
@@ -2019,27 +2702,27 @@
 </ds:datastoreItem>
 </file>
 
+<file path=customXml/itemProps2.xml><?xml version="1.0" encoding="utf-8"?>
+<ds:datastoreItem xmlns:ds="http://schemas.openxmlformats.org/officeDocument/2006/customXml" ds:itemID="{AE6E4666-AC04-4DCD-91DD-2E7D024D2C6A}">
+  <ds:schemaRefs>
+    <ds:schemaRef ds:uri="http://schemas.microsoft.com/sharepoint/v3/contenttype/forms"/>
+  </ds:schemaRefs>
+</ds:datastoreItem>
+</file>
+
 <file path=customXml/itemProps3.xml><?xml version="1.0" encoding="utf-8"?>
+<ds:datastoreItem xmlns:ds="http://schemas.openxmlformats.org/officeDocument/2006/customXml" ds:itemID="{ED9DE137-99BC-4C66-95F3-61DE9799BBA4}">
+  <ds:schemaRefs>
+    <ds:schemaRef ds:uri="http://schemas.microsoft.com/office/2006/metadata/properties"/>
+    <ds:schemaRef ds:uri="http://schemas.microsoft.com/office/infopath/2007/PartnerControls"/>
+  </ds:schemaRefs>
+</ds:datastoreItem>
+</file>
+
+<file path=customXml/itemProps4.xml><?xml version="1.0" encoding="utf-8"?>
 <ds:datastoreItem xmlns:ds="http://schemas.openxmlformats.org/officeDocument/2006/customXml" ds:itemID="{9039888A-FCF6-43D4-BBD6-ABEC15D61749}">
   <ds:schemaRefs>
     <ds:schemaRef ds:uri="http://schemas.openxmlformats.org/officeDocument/2006/bibliography"/>
   </ds:schemaRefs>
 </ds:datastoreItem>
-</file>
-
-<file path=customXml/itemProps4.xml><?xml version="1.0" encoding="utf-8"?>
-<ds:datastoreItem xmlns:ds="http://schemas.openxmlformats.org/officeDocument/2006/customXml" ds:itemID="{ED9DE137-99BC-4C66-95F3-61DE9799BBA4}">
-  <ds:schemaRefs>
-    <ds:schemaRef ds:uri="http://schemas.microsoft.com/office/2006/documentManagement/types"/>
-    <ds:schemaRef ds:uri="http://schemas.microsoft.com/office/infopath/2007/PartnerControls"/>
-    <ds:schemaRef ds:uri="http://purl.org/dc/elements/1.1/"/>
-    <ds:schemaRef ds:uri="http://schemas.microsoft.com/office/2006/metadata/properties"/>
-    <ds:schemaRef ds:uri="06495c1e-0b89-4543-a0b9-30024fab14e7"/>
-    <ds:schemaRef ds:uri="f77a0f52-3b1d-4bfc-b86f-2a4dba093020"/>
-    <ds:schemaRef ds:uri="http://purl.org/dc/terms/"/>
-    <ds:schemaRef ds:uri="http://schemas.openxmlformats.org/package/2006/metadata/core-properties"/>
-    <ds:schemaRef ds:uri="http://www.w3.org/XML/1998/namespace"/>
-    <ds:schemaRef ds:uri="http://purl.org/dc/dcmitype/"/>
-  </ds:schemaRefs>
-</ds:datastoreItem>
 </file>
</xml_diff>